<commit_message>
Mark M.S. in Artificial Intelligence as completed
Co-Authored-By: Claude Opus 5.5 (1M context) <noreply@anthropic.com>
</commit_message>
<xml_diff>
--- a/Rajesh Kumar Sahoo - Resume Oct 2026.docx
+++ b/Rajesh Kumar Sahoo - Resume Oct 2026.docx
@@ -201,7 +201,7 @@
           <w:spacing w:val="0"/>
           <w:color w:val="171E2D"/>
         </w:rPr>
-        <w:t xml:space="preserve">Currently pursuing an M.S. in Artificial Intelligence at University of the Cumberlands.</w:t>
+        <w:t xml:space="preserve">M.S. in Artificial Intelligence, University of the Cumberlands.</w:t>
       </w:r>
     </w:p>
     <w:p>
@@ -2706,7 +2706,7 @@
           <w:spacing w:val="0"/>
           <w:color w:val="171E2D"/>
         </w:rPr>
-        <w:t xml:space="preserve"> — University of the Cumberlands · Aug 2025 – Present</w:t>
+        <w:t xml:space="preserve"> — University of the Cumberlands · Completed 2026</w:t>
       </w:r>
     </w:p>
     <w:p>

</xml_diff>